<commit_message>
Cập nhật LAB5 (link video, README) và thêm bài giữa kỳ DT043
</commit_message>
<xml_diff>
--- a/LAB5/Lab5_11CNPM2_1150080120_HoangThanhTra.docx
+++ b/LAB5/Lab5_11CNPM2_1150080120_HoangThanhTra.docx
@@ -54,28 +54,23 @@
         <w:t>Link Youtube:</w:t>
       </w:r>
       <w:r>
-        <w:rPr>
-          <w:highlight w:val="yellow"/>
-        </w:rPr>
+        <w:rPr/>
         <w:t xml:space="preserve"> </w:t>
       </w:r>
       <w:r>
         <w:rPr>
-          <w:highlight w:val="none"/>
           <w:lang w:val="en-US"/>
         </w:rPr>
         <w:fldChar w:fldCharType="begin"/>
       </w:r>
       <w:r>
         <w:rPr>
-          <w:highlight w:val="none"/>
           <w:lang w:val="en-US"/>
         </w:rPr>
         <w:instrText xml:space="preserve"> HYPERLINK "https://youtu.be/lk4EdLtkH1o" </w:instrText>
       </w:r>
       <w:r>
         <w:rPr>
-          <w:highlight w:val="none"/>
           <w:lang w:val="en-US"/>
         </w:rPr>
         <w:fldChar w:fldCharType="separate"/>
@@ -83,14 +78,12 @@
       <w:r>
         <w:rPr>
           <w:rStyle w:val="20"/>
-          <w:highlight w:val="none"/>
           <w:lang w:val="en-US"/>
         </w:rPr>
         <w:t>https://youtu.be/lk4EdLtkH1o</w:t>
       </w:r>
       <w:r>
         <w:rPr>
-          <w:highlight w:val="none"/>
           <w:lang w:val="en-US"/>
         </w:rPr>
         <w:fldChar w:fldCharType="end"/>

</xml_diff>

<commit_message>
LAB5: cập nhật báo cáo Word với ảnh thực hành và thêm thư mục ảnh minh chứng
</commit_message>
<xml_diff>
--- a/LAB5/Lab5_11CNPM2_1150080120_HoangThanhTra.docx
+++ b/LAB5/Lab5_11CNPM2_1150080120_HoangThanhTra.docx
@@ -54,7 +54,6 @@
         <w:t>Link Youtube:</w:t>
       </w:r>
       <w:r>
-        <w:rPr/>
         <w:t xml:space="preserve"> </w:t>
       </w:r>
       <w:r>
@@ -197,12 +196,6 @@
             <w:insideH w:val="single" w:color="auto" w:sz="4" w:space="0"/>
             <w:insideV w:val="single" w:color="auto" w:sz="4" w:space="0"/>
           </w:tblBorders>
-          <w:tblCellMar>
-            <w:top w:w="0" w:type="dxa"/>
-            <w:left w:w="108" w:type="dxa"/>
-            <w:bottom w:w="0" w:type="dxa"/>
-            <w:right w:w="108" w:type="dxa"/>
-          </w:tblCellMar>
         </w:tblPrEx>
         <w:tc>
           <w:tcPr>
@@ -338,6 +331,12 @@
             <w:insideH w:val="single" w:color="auto" w:sz="4" w:space="0"/>
             <w:insideV w:val="single" w:color="auto" w:sz="4" w:space="0"/>
           </w:tblBorders>
+          <w:tblCellMar>
+            <w:top w:w="0" w:type="dxa"/>
+            <w:left w:w="108" w:type="dxa"/>
+            <w:bottom w:w="0" w:type="dxa"/>
+            <w:right w:w="108" w:type="dxa"/>
+          </w:tblCellMar>
         </w:tblPrEx>
         <w:tc>
           <w:tcPr>
@@ -1494,16 +1493,18 @@
     <w:p>
       <w:pPr>
         <w:jc w:val="center"/>
+        <w:rPr>
+          <w:b w:val="0"/>
+          <w:i/>
+          <w:sz w:val="22"/>
+        </w:rPr>
       </w:pPr>
       <w:r>
-        <w:rPr>
-          <w:rFonts w:ascii="Times New Roman" w:hAnsi="Times New Roman" w:cs="Times New Roman"/>
-        </w:rPr>
         <w:drawing>
-          <wp:inline distT="0" distB="0" distL="0" distR="0">
-            <wp:extent cx="6309360" cy="4162425"/>
-            <wp:effectExtent l="0" t="0" r="0" b="13335"/>
-            <wp:docPr id="2056219718" name="Picture 1"/>
+          <wp:inline distT="0" distB="0" distL="114300" distR="114300">
+            <wp:extent cx="5483225" cy="5648325"/>
+            <wp:effectExtent l="0" t="0" r="3175" b="5715"/>
+            <wp:docPr id="7" name="Picture 4"/>
             <wp:cNvGraphicFramePr>
               <a:graphicFrameLocks xmlns:a="http://schemas.openxmlformats.org/drawingml/2006/main" noChangeAspect="1"/>
             </wp:cNvGraphicFramePr>
@@ -1511,7 +1512,7 @@
               <a:graphicData uri="http://schemas.openxmlformats.org/drawingml/2006/picture">
                 <pic:pic xmlns:pic="http://schemas.openxmlformats.org/drawingml/2006/picture">
                   <pic:nvPicPr>
-                    <pic:cNvPr id="2056219718" name="Picture 1"/>
+                    <pic:cNvPr id="7" name="Picture 4"/>
                     <pic:cNvPicPr>
                       <a:picLocks noChangeAspect="1"/>
                     </pic:cNvPicPr>
@@ -1525,11 +1526,15 @@
                   <pic:spPr>
                     <a:xfrm>
                       <a:off x="0" y="0"/>
-                      <a:ext cx="6309360" cy="4162425"/>
+                      <a:ext cx="5483225" cy="5648325"/>
                     </a:xfrm>
                     <a:prstGeom prst="rect">
                       <a:avLst/>
                     </a:prstGeom>
+                    <a:noFill/>
+                    <a:ln>
+                      <a:noFill/>
+                    </a:ln>
                   </pic:spPr>
                 </pic:pic>
               </a:graphicData>
@@ -1538,14 +1543,11 @@
         </w:drawing>
       </w:r>
       <w:r>
-        <w:rPr>
-          <w:rFonts w:ascii="Times New Roman" w:hAnsi="Times New Roman" w:cs="Times New Roman"/>
-        </w:rPr>
         <w:drawing>
-          <wp:inline distT="0" distB="0" distL="0" distR="0">
-            <wp:extent cx="5814060" cy="4274820"/>
-            <wp:effectExtent l="0" t="0" r="7620" b="7620"/>
-            <wp:docPr id="473804192" name="Picture 1"/>
+          <wp:inline distT="0" distB="0" distL="114300" distR="114300">
+            <wp:extent cx="5486400" cy="2914650"/>
+            <wp:effectExtent l="0" t="0" r="0" b="11430"/>
+            <wp:docPr id="8" name="Picture 5"/>
             <wp:cNvGraphicFramePr>
               <a:graphicFrameLocks xmlns:a="http://schemas.openxmlformats.org/drawingml/2006/main" noChangeAspect="1"/>
             </wp:cNvGraphicFramePr>
@@ -1553,7 +1555,7 @@
               <a:graphicData uri="http://schemas.openxmlformats.org/drawingml/2006/picture">
                 <pic:pic xmlns:pic="http://schemas.openxmlformats.org/drawingml/2006/picture">
                   <pic:nvPicPr>
-                    <pic:cNvPr id="473804192" name="Picture 1"/>
+                    <pic:cNvPr id="8" name="Picture 5"/>
                     <pic:cNvPicPr>
                       <a:picLocks noChangeAspect="1"/>
                     </pic:cNvPicPr>
@@ -1567,11 +1569,15 @@
                   <pic:spPr>
                     <a:xfrm>
                       <a:off x="0" y="0"/>
-                      <a:ext cx="5814564" cy="4275190"/>
+                      <a:ext cx="5486400" cy="2914650"/>
                     </a:xfrm>
                     <a:prstGeom prst="rect">
                       <a:avLst/>
                     </a:prstGeom>
+                    <a:noFill/>
+                    <a:ln>
+                      <a:noFill/>
+                    </a:ln>
                   </pic:spPr>
                 </pic:pic>
               </a:graphicData>
@@ -1586,6 +1592,59 @@
           <w:sz w:val="22"/>
         </w:rPr>
         <w:t>Hình 3. Console pfSense đặt LAN 10.0.0.1/8, không bật DHCP</w:t>
+      </w:r>
+    </w:p>
+    <w:p>
+      <w:pPr>
+        <w:jc w:val="center"/>
+        <w:rPr>
+          <w:b w:val="0"/>
+          <w:i/>
+          <w:sz w:val="22"/>
+        </w:rPr>
+      </w:pPr>
+      <w:r>
+        <w:drawing>
+          <wp:inline distT="0" distB="0" distL="114300" distR="114300">
+            <wp:extent cx="5478780" cy="3340735"/>
+            <wp:effectExtent l="0" t="0" r="7620" b="12065"/>
+            <wp:docPr id="10" name="Picture 7"/>
+            <wp:cNvGraphicFramePr>
+              <a:graphicFrameLocks xmlns:a="http://schemas.openxmlformats.org/drawingml/2006/main" noChangeAspect="1"/>
+            </wp:cNvGraphicFramePr>
+            <a:graphic xmlns:a="http://schemas.openxmlformats.org/drawingml/2006/main">
+              <a:graphicData uri="http://schemas.openxmlformats.org/drawingml/2006/picture">
+                <pic:pic xmlns:pic="http://schemas.openxmlformats.org/drawingml/2006/picture">
+                  <pic:nvPicPr>
+                    <pic:cNvPr id="10" name="Picture 7"/>
+                    <pic:cNvPicPr>
+                      <a:picLocks noChangeAspect="1"/>
+                    </pic:cNvPicPr>
+                  </pic:nvPicPr>
+                  <pic:blipFill>
+                    <a:blip r:embed="rId10"/>
+                    <a:stretch>
+                      <a:fillRect/>
+                    </a:stretch>
+                  </pic:blipFill>
+                  <pic:spPr>
+                    <a:xfrm>
+                      <a:off x="0" y="0"/>
+                      <a:ext cx="5478780" cy="3340735"/>
+                    </a:xfrm>
+                    <a:prstGeom prst="rect">
+                      <a:avLst/>
+                    </a:prstGeom>
+                    <a:noFill/>
+                    <a:ln>
+                      <a:noFill/>
+                    </a:ln>
+                  </pic:spPr>
+                </pic:pic>
+              </a:graphicData>
+            </a:graphic>
+          </wp:inline>
+        </w:drawing>
       </w:r>
     </w:p>
     <w:p>
@@ -1609,16 +1668,18 @@
     <w:p>
       <w:pPr>
         <w:jc w:val="center"/>
+        <w:rPr>
+          <w:b w:val="0"/>
+          <w:i/>
+          <w:sz w:val="22"/>
+        </w:rPr>
       </w:pPr>
       <w:r>
-        <w:rPr>
-          <w:rFonts w:ascii="Times New Roman" w:hAnsi="Times New Roman" w:cs="Times New Roman"/>
-        </w:rPr>
         <w:drawing>
-          <wp:inline distT="0" distB="0" distL="0" distR="0">
-            <wp:extent cx="5814060" cy="4274820"/>
-            <wp:effectExtent l="0" t="0" r="7620" b="7620"/>
-            <wp:docPr id="4" name="Picture 1"/>
+          <wp:inline distT="0" distB="0" distL="114300" distR="114300">
+            <wp:extent cx="5486400" cy="2914650"/>
+            <wp:effectExtent l="0" t="0" r="0" b="11430"/>
+            <wp:docPr id="11" name="Picture 8"/>
             <wp:cNvGraphicFramePr>
               <a:graphicFrameLocks xmlns:a="http://schemas.openxmlformats.org/drawingml/2006/main" noChangeAspect="1"/>
             </wp:cNvGraphicFramePr>
@@ -1626,13 +1687,13 @@
               <a:graphicData uri="http://schemas.openxmlformats.org/drawingml/2006/picture">
                 <pic:pic xmlns:pic="http://schemas.openxmlformats.org/drawingml/2006/picture">
                   <pic:nvPicPr>
-                    <pic:cNvPr id="4" name="Picture 1"/>
+                    <pic:cNvPr id="11" name="Picture 8"/>
                     <pic:cNvPicPr>
                       <a:picLocks noChangeAspect="1"/>
                     </pic:cNvPicPr>
                   </pic:nvPicPr>
                   <pic:blipFill>
-                    <a:blip r:embed="rId9"/>
+                    <a:blip r:embed="rId11"/>
                     <a:stretch>
                       <a:fillRect/>
                     </a:stretch>
@@ -1640,11 +1701,15 @@
                   <pic:spPr>
                     <a:xfrm>
                       <a:off x="0" y="0"/>
-                      <a:ext cx="5814564" cy="4275190"/>
+                      <a:ext cx="5486400" cy="2914650"/>
                     </a:xfrm>
                     <a:prstGeom prst="rect">
                       <a:avLst/>
                     </a:prstGeom>
+                    <a:noFill/>
+                    <a:ln>
+                      <a:noFill/>
+                    </a:ln>
                   </pic:spPr>
                 </pic:pic>
               </a:graphicData>
@@ -1652,6 +1717,16 @@
           </wp:inline>
         </w:drawing>
       </w:r>
+    </w:p>
+    <w:p>
+      <w:pPr>
+        <w:jc w:val="center"/>
+        <w:rPr>
+          <w:b w:val="0"/>
+          <w:i/>
+          <w:sz w:val="22"/>
+        </w:rPr>
+      </w:pPr>
       <w:r>
         <w:rPr>
           <w:b w:val="0"/>
@@ -1659,6 +1734,59 @@
           <w:sz w:val="22"/>
         </w:rPr>
         <w:t>Hình 4. Dashboard pfSense (WAN nhận IP qua DHCP, LAN 10.0.0.1)</w:t>
+      </w:r>
+    </w:p>
+    <w:p>
+      <w:pPr>
+        <w:jc w:val="center"/>
+        <w:rPr>
+          <w:b w:val="0"/>
+          <w:i/>
+          <w:sz w:val="22"/>
+        </w:rPr>
+      </w:pPr>
+      <w:r>
+        <w:drawing>
+          <wp:inline distT="0" distB="0" distL="114300" distR="114300">
+            <wp:extent cx="5486400" cy="2914650"/>
+            <wp:effectExtent l="0" t="0" r="0" b="11430"/>
+            <wp:docPr id="12" name="Picture 9"/>
+            <wp:cNvGraphicFramePr>
+              <a:graphicFrameLocks xmlns:a="http://schemas.openxmlformats.org/drawingml/2006/main" noChangeAspect="1"/>
+            </wp:cNvGraphicFramePr>
+            <a:graphic xmlns:a="http://schemas.openxmlformats.org/drawingml/2006/main">
+              <a:graphicData uri="http://schemas.openxmlformats.org/drawingml/2006/picture">
+                <pic:pic xmlns:pic="http://schemas.openxmlformats.org/drawingml/2006/picture">
+                  <pic:nvPicPr>
+                    <pic:cNvPr id="12" name="Picture 9"/>
+                    <pic:cNvPicPr>
+                      <a:picLocks noChangeAspect="1"/>
+                    </pic:cNvPicPr>
+                  </pic:nvPicPr>
+                  <pic:blipFill>
+                    <a:blip r:embed="rId12"/>
+                    <a:stretch>
+                      <a:fillRect/>
+                    </a:stretch>
+                  </pic:blipFill>
+                  <pic:spPr>
+                    <a:xfrm>
+                      <a:off x="0" y="0"/>
+                      <a:ext cx="5486400" cy="2914650"/>
+                    </a:xfrm>
+                    <a:prstGeom prst="rect">
+                      <a:avLst/>
+                    </a:prstGeom>
+                    <a:noFill/>
+                    <a:ln>
+                      <a:noFill/>
+                    </a:ln>
+                  </pic:spPr>
+                </pic:pic>
+              </a:graphicData>
+            </a:graphic>
+          </wp:inline>
+        </w:drawing>
       </w:r>
     </w:p>
     <w:p>
@@ -1671,12 +1799,198 @@
       </w:r>
     </w:p>
     <w:p>
+      <w:pPr>
+        <w:rPr>
+          <w:b w:val="0"/>
+          <w:i w:val="0"/>
+        </w:rPr>
+      </w:pPr>
       <w:r>
         <w:rPr>
           <w:b w:val="0"/>
           <w:i w:val="0"/>
         </w:rPr>
         <w:t>Windows Server 2025: IP 10.0.0.2/8, gateway 10.0.0.1, DNS 10.0.0.2; cài AD DS, tạo forest vietnam.local; DNS Forwarder 8.8.8.8.</w:t>
+      </w:r>
+    </w:p>
+    <w:p>
+      <w:r>
+        <w:drawing>
+          <wp:inline distT="0" distB="0" distL="114300" distR="114300">
+            <wp:extent cx="5486400" cy="2914650"/>
+            <wp:effectExtent l="0" t="0" r="0" b="11430"/>
+            <wp:docPr id="13" name="Picture 10"/>
+            <wp:cNvGraphicFramePr>
+              <a:graphicFrameLocks xmlns:a="http://schemas.openxmlformats.org/drawingml/2006/main" noChangeAspect="1"/>
+            </wp:cNvGraphicFramePr>
+            <a:graphic xmlns:a="http://schemas.openxmlformats.org/drawingml/2006/main">
+              <a:graphicData uri="http://schemas.openxmlformats.org/drawingml/2006/picture">
+                <pic:pic xmlns:pic="http://schemas.openxmlformats.org/drawingml/2006/picture">
+                  <pic:nvPicPr>
+                    <pic:cNvPr id="13" name="Picture 10"/>
+                    <pic:cNvPicPr>
+                      <a:picLocks noChangeAspect="1"/>
+                    </pic:cNvPicPr>
+                  </pic:nvPicPr>
+                  <pic:blipFill>
+                    <a:blip r:embed="rId13"/>
+                    <a:stretch>
+                      <a:fillRect/>
+                    </a:stretch>
+                  </pic:blipFill>
+                  <pic:spPr>
+                    <a:xfrm>
+                      <a:off x="0" y="0"/>
+                      <a:ext cx="5486400" cy="2914650"/>
+                    </a:xfrm>
+                    <a:prstGeom prst="rect">
+                      <a:avLst/>
+                    </a:prstGeom>
+                    <a:noFill/>
+                    <a:ln>
+                      <a:noFill/>
+                    </a:ln>
+                  </pic:spPr>
+                </pic:pic>
+              </a:graphicData>
+            </a:graphic>
+          </wp:inline>
+        </w:drawing>
+      </w:r>
+    </w:p>
+    <w:p>
+      <w:r>
+        <w:drawing>
+          <wp:inline distT="0" distB="0" distL="114300" distR="114300">
+            <wp:extent cx="5486400" cy="2914650"/>
+            <wp:effectExtent l="0" t="0" r="0" b="11430"/>
+            <wp:docPr id="14" name="Picture 11"/>
+            <wp:cNvGraphicFramePr>
+              <a:graphicFrameLocks xmlns:a="http://schemas.openxmlformats.org/drawingml/2006/main" noChangeAspect="1"/>
+            </wp:cNvGraphicFramePr>
+            <a:graphic xmlns:a="http://schemas.openxmlformats.org/drawingml/2006/main">
+              <a:graphicData uri="http://schemas.openxmlformats.org/drawingml/2006/picture">
+                <pic:pic xmlns:pic="http://schemas.openxmlformats.org/drawingml/2006/picture">
+                  <pic:nvPicPr>
+                    <pic:cNvPr id="14" name="Picture 11"/>
+                    <pic:cNvPicPr>
+                      <a:picLocks noChangeAspect="1"/>
+                    </pic:cNvPicPr>
+                  </pic:nvPicPr>
+                  <pic:blipFill>
+                    <a:blip r:embed="rId14"/>
+                    <a:stretch>
+                      <a:fillRect/>
+                    </a:stretch>
+                  </pic:blipFill>
+                  <pic:spPr>
+                    <a:xfrm>
+                      <a:off x="0" y="0"/>
+                      <a:ext cx="5486400" cy="2914650"/>
+                    </a:xfrm>
+                    <a:prstGeom prst="rect">
+                      <a:avLst/>
+                    </a:prstGeom>
+                    <a:noFill/>
+                    <a:ln>
+                      <a:noFill/>
+                    </a:ln>
+                  </pic:spPr>
+                </pic:pic>
+              </a:graphicData>
+            </a:graphic>
+          </wp:inline>
+        </w:drawing>
+      </w:r>
+    </w:p>
+    <w:p>
+      <w:r>
+        <w:drawing>
+          <wp:inline distT="0" distB="0" distL="114300" distR="114300">
+            <wp:extent cx="5480685" cy="2908300"/>
+            <wp:effectExtent l="0" t="0" r="5715" b="2540"/>
+            <wp:docPr id="16" name="Picture 13"/>
+            <wp:cNvGraphicFramePr>
+              <a:graphicFrameLocks xmlns:a="http://schemas.openxmlformats.org/drawingml/2006/main" noChangeAspect="1"/>
+            </wp:cNvGraphicFramePr>
+            <a:graphic xmlns:a="http://schemas.openxmlformats.org/drawingml/2006/main">
+              <a:graphicData uri="http://schemas.openxmlformats.org/drawingml/2006/picture">
+                <pic:pic xmlns:pic="http://schemas.openxmlformats.org/drawingml/2006/picture">
+                  <pic:nvPicPr>
+                    <pic:cNvPr id="16" name="Picture 13"/>
+                    <pic:cNvPicPr>
+                      <a:picLocks noChangeAspect="1"/>
+                    </pic:cNvPicPr>
+                  </pic:nvPicPr>
+                  <pic:blipFill>
+                    <a:blip r:embed="rId15"/>
+                    <a:stretch>
+                      <a:fillRect/>
+                    </a:stretch>
+                  </pic:blipFill>
+                  <pic:spPr>
+                    <a:xfrm>
+                      <a:off x="0" y="0"/>
+                      <a:ext cx="5480685" cy="2908300"/>
+                    </a:xfrm>
+                    <a:prstGeom prst="rect">
+                      <a:avLst/>
+                    </a:prstGeom>
+                    <a:noFill/>
+                    <a:ln>
+                      <a:noFill/>
+                    </a:ln>
+                  </pic:spPr>
+                </pic:pic>
+              </a:graphicData>
+            </a:graphic>
+          </wp:inline>
+        </w:drawing>
+      </w:r>
+    </w:p>
+    <w:p>
+      <w:r>
+        <w:drawing>
+          <wp:inline distT="0" distB="0" distL="114300" distR="114300">
+            <wp:extent cx="5486400" cy="2914650"/>
+            <wp:effectExtent l="0" t="0" r="0" b="11430"/>
+            <wp:docPr id="17" name="Picture 14"/>
+            <wp:cNvGraphicFramePr>
+              <a:graphicFrameLocks xmlns:a="http://schemas.openxmlformats.org/drawingml/2006/main" noChangeAspect="1"/>
+            </wp:cNvGraphicFramePr>
+            <a:graphic xmlns:a="http://schemas.openxmlformats.org/drawingml/2006/main">
+              <a:graphicData uri="http://schemas.openxmlformats.org/drawingml/2006/picture">
+                <pic:pic xmlns:pic="http://schemas.openxmlformats.org/drawingml/2006/picture">
+                  <pic:nvPicPr>
+                    <pic:cNvPr id="17" name="Picture 14"/>
+                    <pic:cNvPicPr>
+                      <a:picLocks noChangeAspect="1"/>
+                    </pic:cNvPicPr>
+                  </pic:nvPicPr>
+                  <pic:blipFill>
+                    <a:blip r:embed="rId16"/>
+                    <a:stretch>
+                      <a:fillRect/>
+                    </a:stretch>
+                  </pic:blipFill>
+                  <pic:spPr>
+                    <a:xfrm>
+                      <a:off x="0" y="0"/>
+                      <a:ext cx="5486400" cy="2914650"/>
+                    </a:xfrm>
+                    <a:prstGeom prst="rect">
+                      <a:avLst/>
+                    </a:prstGeom>
+                    <a:noFill/>
+                    <a:ln>
+                      <a:noFill/>
+                    </a:ln>
+                  </pic:spPr>
+                </pic:pic>
+              </a:graphicData>
+            </a:graphic>
+          </wp:inline>
+        </w:drawing>
       </w:r>
     </w:p>
     <w:p>
@@ -1689,6 +2003,12 @@
       </w:r>
     </w:p>
     <w:p>
+      <w:pPr>
+        <w:rPr>
+          <w:b w:val="0"/>
+          <w:i w:val="0"/>
+        </w:rPr>
+      </w:pPr>
       <w:r>
         <w:rPr>
           <w:b w:val="0"/>
@@ -1699,17 +2019,17 @@
     </w:p>
     <w:p>
       <w:pPr>
-        <w:jc w:val="center"/>
+        <w:rPr>
+          <w:b w:val="0"/>
+          <w:i w:val="0"/>
+        </w:rPr>
       </w:pPr>
       <w:r>
-        <w:rPr>
-          <w:rFonts w:ascii="Times New Roman" w:hAnsi="Times New Roman" w:cs="Times New Roman"/>
-        </w:rPr>
         <w:drawing>
-          <wp:inline distT="0" distB="0" distL="0" distR="0">
-            <wp:extent cx="6309360" cy="5057775"/>
-            <wp:effectExtent l="0" t="0" r="0" b="1905"/>
-            <wp:docPr id="194212357" name="Picture 1"/>
+          <wp:inline distT="0" distB="0" distL="114300" distR="114300">
+            <wp:extent cx="5486400" cy="2914650"/>
+            <wp:effectExtent l="0" t="0" r="0" b="11430"/>
+            <wp:docPr id="19" name="Picture 16"/>
             <wp:cNvGraphicFramePr>
               <a:graphicFrameLocks xmlns:a="http://schemas.openxmlformats.org/drawingml/2006/main" noChangeAspect="1"/>
             </wp:cNvGraphicFramePr>
@@ -1717,13 +2037,13 @@
               <a:graphicData uri="http://schemas.openxmlformats.org/drawingml/2006/picture">
                 <pic:pic xmlns:pic="http://schemas.openxmlformats.org/drawingml/2006/picture">
                   <pic:nvPicPr>
-                    <pic:cNvPr id="194212357" name="Picture 1"/>
+                    <pic:cNvPr id="19" name="Picture 16"/>
                     <pic:cNvPicPr>
                       <a:picLocks noChangeAspect="1"/>
                     </pic:cNvPicPr>
                   </pic:nvPicPr>
                   <pic:blipFill>
-                    <a:blip r:embed="rId10"/>
+                    <a:blip r:embed="rId17"/>
                     <a:stretch>
                       <a:fillRect/>
                     </a:stretch>
@@ -1731,11 +2051,15 @@
                   <pic:spPr>
                     <a:xfrm>
                       <a:off x="0" y="0"/>
-                      <a:ext cx="6309360" cy="5057775"/>
+                      <a:ext cx="5486400" cy="2914650"/>
                     </a:xfrm>
                     <a:prstGeom prst="rect">
                       <a:avLst/>
                     </a:prstGeom>
+                    <a:noFill/>
+                    <a:ln>
+                      <a:noFill/>
+                    </a:ln>
                   </pic:spPr>
                 </pic:pic>
               </a:graphicData>
@@ -1743,6 +2067,11 @@
           </wp:inline>
         </w:drawing>
       </w:r>
+    </w:p>
+    <w:p>
+      <w:pPr>
+        <w:jc w:val="center"/>
+      </w:pPr>
       <w:r>
         <w:rPr>
           <w:b w:val="0"/>
@@ -1766,14 +2095,11 @@
         <w:jc w:val="center"/>
       </w:pPr>
       <w:r>
-        <w:rPr>
-          <w:rFonts w:ascii="Times New Roman" w:hAnsi="Times New Roman" w:cs="Times New Roman"/>
-        </w:rPr>
         <w:drawing>
-          <wp:inline distT="0" distB="0" distL="0" distR="0">
-            <wp:extent cx="6309360" cy="5057775"/>
-            <wp:effectExtent l="0" t="0" r="0" b="1905"/>
-            <wp:docPr id="1332173976" name="Picture 1"/>
+          <wp:inline distT="0" distB="0" distL="114300" distR="114300">
+            <wp:extent cx="5486400" cy="2914650"/>
+            <wp:effectExtent l="0" t="0" r="0" b="11430"/>
+            <wp:docPr id="20" name="Picture 17"/>
             <wp:cNvGraphicFramePr>
               <a:graphicFrameLocks xmlns:a="http://schemas.openxmlformats.org/drawingml/2006/main" noChangeAspect="1"/>
             </wp:cNvGraphicFramePr>
@@ -1781,13 +2107,13 @@
               <a:graphicData uri="http://schemas.openxmlformats.org/drawingml/2006/picture">
                 <pic:pic xmlns:pic="http://schemas.openxmlformats.org/drawingml/2006/picture">
                   <pic:nvPicPr>
-                    <pic:cNvPr id="1332173976" name="Picture 1"/>
+                    <pic:cNvPr id="20" name="Picture 17"/>
                     <pic:cNvPicPr>
                       <a:picLocks noChangeAspect="1"/>
                     </pic:cNvPicPr>
                   </pic:nvPicPr>
                   <pic:blipFill>
-                    <a:blip r:embed="rId10"/>
+                    <a:blip r:embed="rId18"/>
                     <a:stretch>
                       <a:fillRect/>
                     </a:stretch>
@@ -1795,11 +2121,15 @@
                   <pic:spPr>
                     <a:xfrm>
                       <a:off x="0" y="0"/>
-                      <a:ext cx="6309360" cy="5057775"/>
+                      <a:ext cx="5486400" cy="2914650"/>
                     </a:xfrm>
                     <a:prstGeom prst="rect">
                       <a:avLst/>
                     </a:prstGeom>
+                    <a:noFill/>
+                    <a:ln>
+                      <a:noFill/>
+                    </a:ln>
                   </pic:spPr>
                 </pic:pic>
               </a:graphicData>
@@ -2080,14 +2410,11 @@
         <w:jc w:val="center"/>
       </w:pPr>
       <w:r>
-        <w:rPr>
-          <w:rFonts w:ascii="Times New Roman" w:hAnsi="Times New Roman" w:cs="Times New Roman"/>
-        </w:rPr>
         <w:drawing>
-          <wp:inline distT="0" distB="0" distL="0" distR="0">
-            <wp:extent cx="5753100" cy="3390900"/>
-            <wp:effectExtent l="0" t="0" r="7620" b="7620"/>
-            <wp:docPr id="1783509949" name="Picture 1"/>
+          <wp:inline distT="0" distB="0" distL="114300" distR="114300">
+            <wp:extent cx="5486400" cy="2914650"/>
+            <wp:effectExtent l="0" t="0" r="0" b="11430"/>
+            <wp:docPr id="21" name="Picture 18"/>
             <wp:cNvGraphicFramePr>
               <a:graphicFrameLocks xmlns:a="http://schemas.openxmlformats.org/drawingml/2006/main" noChangeAspect="1"/>
             </wp:cNvGraphicFramePr>
@@ -2095,13 +2422,13 @@
               <a:graphicData uri="http://schemas.openxmlformats.org/drawingml/2006/picture">
                 <pic:pic xmlns:pic="http://schemas.openxmlformats.org/drawingml/2006/picture">
                   <pic:nvPicPr>
-                    <pic:cNvPr id="1783509949" name="Picture 1"/>
+                    <pic:cNvPr id="21" name="Picture 18"/>
                     <pic:cNvPicPr>
                       <a:picLocks noChangeAspect="1"/>
                     </pic:cNvPicPr>
                   </pic:nvPicPr>
                   <pic:blipFill>
-                    <a:blip r:embed="rId11"/>
+                    <a:blip r:embed="rId19"/>
                     <a:stretch>
                       <a:fillRect/>
                     </a:stretch>
@@ -2109,11 +2436,15 @@
                   <pic:spPr>
                     <a:xfrm>
                       <a:off x="0" y="0"/>
-                      <a:ext cx="5753599" cy="3391194"/>
+                      <a:ext cx="5486400" cy="2914650"/>
                     </a:xfrm>
                     <a:prstGeom prst="rect">
                       <a:avLst/>
                     </a:prstGeom>
+                    <a:noFill/>
+                    <a:ln>
+                      <a:noFill/>
+                    </a:ln>
                   </pic:spPr>
                 </pic:pic>
               </a:graphicData>
@@ -2121,6 +2452,112 @@
           </wp:inline>
         </w:drawing>
       </w:r>
+    </w:p>
+    <w:p>
+      <w:pPr>
+        <w:jc w:val="center"/>
+      </w:pPr>
+      <w:r>
+        <w:drawing>
+          <wp:inline distT="0" distB="0" distL="114300" distR="114300">
+            <wp:extent cx="5486400" cy="2914650"/>
+            <wp:effectExtent l="0" t="0" r="0" b="11430"/>
+            <wp:docPr id="25" name="Picture 22"/>
+            <wp:cNvGraphicFramePr>
+              <a:graphicFrameLocks xmlns:a="http://schemas.openxmlformats.org/drawingml/2006/main" noChangeAspect="1"/>
+            </wp:cNvGraphicFramePr>
+            <a:graphic xmlns:a="http://schemas.openxmlformats.org/drawingml/2006/main">
+              <a:graphicData uri="http://schemas.openxmlformats.org/drawingml/2006/picture">
+                <pic:pic xmlns:pic="http://schemas.openxmlformats.org/drawingml/2006/picture">
+                  <pic:nvPicPr>
+                    <pic:cNvPr id="25" name="Picture 22"/>
+                    <pic:cNvPicPr>
+                      <a:picLocks noChangeAspect="1"/>
+                    </pic:cNvPicPr>
+                  </pic:nvPicPr>
+                  <pic:blipFill>
+                    <a:blip r:embed="rId20"/>
+                    <a:stretch>
+                      <a:fillRect/>
+                    </a:stretch>
+                  </pic:blipFill>
+                  <pic:spPr>
+                    <a:xfrm>
+                      <a:off x="0" y="0"/>
+                      <a:ext cx="5486400" cy="2914650"/>
+                    </a:xfrm>
+                    <a:prstGeom prst="rect">
+                      <a:avLst/>
+                    </a:prstGeom>
+                    <a:noFill/>
+                    <a:ln>
+                      <a:noFill/>
+                    </a:ln>
+                  </pic:spPr>
+                </pic:pic>
+              </a:graphicData>
+            </a:graphic>
+          </wp:inline>
+        </w:drawing>
+      </w:r>
+    </w:p>
+    <w:p>
+      <w:pPr>
+        <w:jc w:val="center"/>
+        <w:rPr>
+          <w:b w:val="0"/>
+          <w:i/>
+          <w:sz w:val="22"/>
+        </w:rPr>
+      </w:pPr>
+      <w:r>
+        <w:drawing>
+          <wp:inline distT="0" distB="0" distL="114300" distR="114300">
+            <wp:extent cx="5486400" cy="2914650"/>
+            <wp:effectExtent l="0" t="0" r="0" b="11430"/>
+            <wp:docPr id="27" name="Picture 24"/>
+            <wp:cNvGraphicFramePr>
+              <a:graphicFrameLocks xmlns:a="http://schemas.openxmlformats.org/drawingml/2006/main" noChangeAspect="1"/>
+            </wp:cNvGraphicFramePr>
+            <a:graphic xmlns:a="http://schemas.openxmlformats.org/drawingml/2006/main">
+              <a:graphicData uri="http://schemas.openxmlformats.org/drawingml/2006/picture">
+                <pic:pic xmlns:pic="http://schemas.openxmlformats.org/drawingml/2006/picture">
+                  <pic:nvPicPr>
+                    <pic:cNvPr id="27" name="Picture 24"/>
+                    <pic:cNvPicPr>
+                      <a:picLocks noChangeAspect="1"/>
+                    </pic:cNvPicPr>
+                  </pic:nvPicPr>
+                  <pic:blipFill>
+                    <a:blip r:embed="rId21"/>
+                    <a:stretch>
+                      <a:fillRect/>
+                    </a:stretch>
+                  </pic:blipFill>
+                  <pic:spPr>
+                    <a:xfrm>
+                      <a:off x="0" y="0"/>
+                      <a:ext cx="5486400" cy="2914650"/>
+                    </a:xfrm>
+                    <a:prstGeom prst="rect">
+                      <a:avLst/>
+                    </a:prstGeom>
+                    <a:noFill/>
+                    <a:ln>
+                      <a:noFill/>
+                    </a:ln>
+                  </pic:spPr>
+                </pic:pic>
+              </a:graphicData>
+            </a:graphic>
+          </wp:inline>
+        </w:drawing>
+      </w:r>
+    </w:p>
+    <w:p>
+      <w:pPr>
+        <w:jc w:val="center"/>
+      </w:pPr>
       <w:r>
         <w:rPr>
           <w:b w:val="0"/>
@@ -2144,16 +2581,11 @@
         <w:jc w:val="center"/>
       </w:pPr>
       <w:r>
-        <w:rPr>
-          <w:rFonts w:ascii="Times New Roman" w:hAnsi="Times New Roman" w:cs="Times New Roman"/>
-          <w:sz w:val="26"/>
-          <w:szCs w:val="26"/>
-        </w:rPr>
         <w:drawing>
-          <wp:inline distT="0" distB="0" distL="0" distR="0">
-            <wp:extent cx="5943600" cy="3650615"/>
-            <wp:effectExtent l="0" t="0" r="0" b="6985"/>
-            <wp:docPr id="1746227294" name="Picture 1"/>
+          <wp:inline distT="0" distB="0" distL="114300" distR="114300">
+            <wp:extent cx="5486400" cy="2914650"/>
+            <wp:effectExtent l="0" t="0" r="0" b="11430"/>
+            <wp:docPr id="28" name="Picture 25"/>
             <wp:cNvGraphicFramePr>
               <a:graphicFrameLocks xmlns:a="http://schemas.openxmlformats.org/drawingml/2006/main" noChangeAspect="1"/>
             </wp:cNvGraphicFramePr>
@@ -2161,13 +2593,13 @@
               <a:graphicData uri="http://schemas.openxmlformats.org/drawingml/2006/picture">
                 <pic:pic xmlns:pic="http://schemas.openxmlformats.org/drawingml/2006/picture">
                   <pic:nvPicPr>
-                    <pic:cNvPr id="1746227294" name="Picture 1"/>
+                    <pic:cNvPr id="28" name="Picture 25"/>
                     <pic:cNvPicPr>
                       <a:picLocks noChangeAspect="1"/>
                     </pic:cNvPicPr>
                   </pic:nvPicPr>
                   <pic:blipFill>
-                    <a:blip r:embed="rId12"/>
+                    <a:blip r:embed="rId22"/>
                     <a:stretch>
                       <a:fillRect/>
                     </a:stretch>
@@ -2175,11 +2607,15 @@
                   <pic:spPr>
                     <a:xfrm>
                       <a:off x="0" y="0"/>
-                      <a:ext cx="5943600" cy="3650615"/>
+                      <a:ext cx="5486400" cy="2914650"/>
                     </a:xfrm>
                     <a:prstGeom prst="rect">
                       <a:avLst/>
                     </a:prstGeom>
+                    <a:noFill/>
+                    <a:ln>
+                      <a:noFill/>
+                    </a:ln>
                   </pic:spPr>
                 </pic:pic>
               </a:graphicData>
@@ -2187,6 +2623,59 @@
           </wp:inline>
         </w:drawing>
       </w:r>
+    </w:p>
+    <w:p>
+      <w:pPr>
+        <w:jc w:val="center"/>
+      </w:pPr>
+      <w:r>
+        <w:drawing>
+          <wp:inline distT="0" distB="0" distL="114300" distR="114300">
+            <wp:extent cx="5486400" cy="2914650"/>
+            <wp:effectExtent l="0" t="0" r="0" b="11430"/>
+            <wp:docPr id="30" name="Picture 27"/>
+            <wp:cNvGraphicFramePr>
+              <a:graphicFrameLocks xmlns:a="http://schemas.openxmlformats.org/drawingml/2006/main" noChangeAspect="1"/>
+            </wp:cNvGraphicFramePr>
+            <a:graphic xmlns:a="http://schemas.openxmlformats.org/drawingml/2006/main">
+              <a:graphicData uri="http://schemas.openxmlformats.org/drawingml/2006/picture">
+                <pic:pic xmlns:pic="http://schemas.openxmlformats.org/drawingml/2006/picture">
+                  <pic:nvPicPr>
+                    <pic:cNvPr id="30" name="Picture 27"/>
+                    <pic:cNvPicPr>
+                      <a:picLocks noChangeAspect="1"/>
+                    </pic:cNvPicPr>
+                  </pic:nvPicPr>
+                  <pic:blipFill>
+                    <a:blip r:embed="rId23"/>
+                    <a:stretch>
+                      <a:fillRect/>
+                    </a:stretch>
+                  </pic:blipFill>
+                  <pic:spPr>
+                    <a:xfrm>
+                      <a:off x="0" y="0"/>
+                      <a:ext cx="5486400" cy="2914650"/>
+                    </a:xfrm>
+                    <a:prstGeom prst="rect">
+                      <a:avLst/>
+                    </a:prstGeom>
+                    <a:noFill/>
+                    <a:ln>
+                      <a:noFill/>
+                    </a:ln>
+                  </pic:spPr>
+                </pic:pic>
+              </a:graphicData>
+            </a:graphic>
+          </wp:inline>
+        </w:drawing>
+      </w:r>
+    </w:p>
+    <w:p>
+      <w:pPr>
+        <w:jc w:val="center"/>
+      </w:pPr>
       <w:r>
         <w:rPr>
           <w:b w:val="0"/>
@@ -2201,16 +2690,11 @@
         <w:jc w:val="center"/>
       </w:pPr>
       <w:r>
-        <w:rPr>
-          <w:rFonts w:ascii="Times New Roman" w:hAnsi="Times New Roman" w:cs="Times New Roman"/>
-          <w:sz w:val="26"/>
-          <w:szCs w:val="26"/>
-        </w:rPr>
         <w:drawing>
-          <wp:inline distT="0" distB="0" distL="0" distR="0">
-            <wp:extent cx="5943600" cy="3650615"/>
-            <wp:effectExtent l="0" t="0" r="0" b="6985"/>
-            <wp:docPr id="5" name="Picture 1"/>
+          <wp:inline distT="0" distB="0" distL="114300" distR="114300">
+            <wp:extent cx="5486400" cy="2914650"/>
+            <wp:effectExtent l="0" t="0" r="0" b="11430"/>
+            <wp:docPr id="32" name="Picture 29"/>
             <wp:cNvGraphicFramePr>
               <a:graphicFrameLocks xmlns:a="http://schemas.openxmlformats.org/drawingml/2006/main" noChangeAspect="1"/>
             </wp:cNvGraphicFramePr>
@@ -2218,13 +2702,13 @@
               <a:graphicData uri="http://schemas.openxmlformats.org/drawingml/2006/picture">
                 <pic:pic xmlns:pic="http://schemas.openxmlformats.org/drawingml/2006/picture">
                   <pic:nvPicPr>
-                    <pic:cNvPr id="5" name="Picture 1"/>
+                    <pic:cNvPr id="32" name="Picture 29"/>
                     <pic:cNvPicPr>
                       <a:picLocks noChangeAspect="1"/>
                     </pic:cNvPicPr>
                   </pic:nvPicPr>
                   <pic:blipFill>
-                    <a:blip r:embed="rId12"/>
+                    <a:blip r:embed="rId24"/>
                     <a:stretch>
                       <a:fillRect/>
                     </a:stretch>
@@ -2232,11 +2716,15 @@
                   <pic:spPr>
                     <a:xfrm>
                       <a:off x="0" y="0"/>
-                      <a:ext cx="5943600" cy="3650615"/>
+                      <a:ext cx="5486400" cy="2914650"/>
                     </a:xfrm>
                     <a:prstGeom prst="rect">
                       <a:avLst/>
                     </a:prstGeom>
+                    <a:noFill/>
+                    <a:ln>
+                      <a:noFill/>
+                    </a:ln>
                   </pic:spPr>
                 </pic:pic>
               </a:graphicData>
@@ -2261,10 +2749,11 @@
         </w:rPr>
         <w:t>Kết quả và giải thích: Khi cả hai Default allow LAN to any đã Disabled, rule nền tảng bị Disabled và state cũ đã được xóa, lưu lượng IPv4 mới từ Domain Controller ra Internet bị chặn. Nếu không Reset States, kết nối đã thiết lập trước đó có thể vẫn hoạt động và làm sai kết luận vì pfSense là stateful firewall.</w:t>
       </w:r>
+    </w:p>
+    <w:p>
       <w:bookmarkStart w:id="0" w:name="_GoBack"/>
       <w:bookmarkEnd w:id="0"/>
     </w:p>
-    <w:p/>
     <w:p>
       <w:pPr>
         <w:spacing w:after="120"/>
@@ -2917,28 +3406,28 @@
     <w:lsdException w:uiPriority="99" w:name="table of authorities"/>
     <w:lsdException w:uiPriority="99" w:semiHidden="0" w:name="macro"/>
     <w:lsdException w:uiPriority="99" w:name="toa heading"/>
-    <w:lsdException w:uiPriority="99" w:semiHidden="0" w:name="List"/>
-    <w:lsdException w:uiPriority="99" w:semiHidden="0" w:name="List Bullet"/>
+    <w:lsdException w:qFormat="1" w:uiPriority="99" w:semiHidden="0" w:name="List"/>
+    <w:lsdException w:qFormat="1" w:uiPriority="99" w:semiHidden="0" w:name="List Bullet"/>
     <w:lsdException w:uiPriority="99" w:semiHidden="0" w:name="List Number"/>
-    <w:lsdException w:uiPriority="99" w:semiHidden="0" w:name="List 2"/>
-    <w:lsdException w:uiPriority="99" w:semiHidden="0" w:name="List 3"/>
+    <w:lsdException w:qFormat="1" w:uiPriority="99" w:semiHidden="0" w:name="List 2"/>
+    <w:lsdException w:qFormat="1" w:uiPriority="99" w:semiHidden="0" w:name="List 3"/>
     <w:lsdException w:uiPriority="99" w:name="List 4"/>
     <w:lsdException w:uiPriority="99" w:name="List 5"/>
     <w:lsdException w:uiPriority="99" w:semiHidden="0" w:name="List Bullet 2"/>
     <w:lsdException w:uiPriority="99" w:semiHidden="0" w:name="List Bullet 3"/>
     <w:lsdException w:uiPriority="99" w:name="List Bullet 4"/>
     <w:lsdException w:uiPriority="99" w:name="List Bullet 5"/>
-    <w:lsdException w:uiPriority="99" w:semiHidden="0" w:name="List Number 2"/>
+    <w:lsdException w:qFormat="1" w:uiPriority="99" w:semiHidden="0" w:name="List Number 2"/>
     <w:lsdException w:uiPriority="99" w:semiHidden="0" w:name="List Number 3"/>
     <w:lsdException w:uiPriority="99" w:name="List Number 4"/>
     <w:lsdException w:uiPriority="99" w:name="List Number 5"/>
     <w:lsdException w:qFormat="1" w:unhideWhenUsed="0" w:uiPriority="10" w:semiHidden="0" w:name="Title"/>
     <w:lsdException w:uiPriority="99" w:name="Closing"/>
     <w:lsdException w:uiPriority="99" w:name="Signature"/>
-    <w:lsdException w:uiPriority="1" w:name="Default Paragraph Font"/>
-    <w:lsdException w:uiPriority="99" w:semiHidden="0" w:name="Body Text"/>
+    <w:lsdException w:qFormat="1" w:uiPriority="1" w:name="Default Paragraph Font"/>
+    <w:lsdException w:qFormat="1" w:uiPriority="99" w:semiHidden="0" w:name="Body Text"/>
     <w:lsdException w:uiPriority="99" w:name="Body Text Indent"/>
-    <w:lsdException w:uiPriority="99" w:semiHidden="0" w:name="List Continue"/>
+    <w:lsdException w:qFormat="1" w:uiPriority="99" w:semiHidden="0" w:name="List Continue"/>
     <w:lsdException w:uiPriority="99" w:semiHidden="0" w:name="List Continue 2"/>
     <w:lsdException w:uiPriority="99" w:semiHidden="0" w:name="List Continue 3"/>
     <w:lsdException w:uiPriority="99" w:name="List Continue 4"/>
@@ -2950,12 +3439,12 @@
     <w:lsdException w:uiPriority="99" w:name="Body Text First Indent"/>
     <w:lsdException w:uiPriority="99" w:name="Body Text First Indent 2"/>
     <w:lsdException w:uiPriority="99" w:name="Note Heading"/>
-    <w:lsdException w:uiPriority="99" w:semiHidden="0" w:name="Body Text 2"/>
-    <w:lsdException w:uiPriority="99" w:semiHidden="0" w:name="Body Text 3"/>
+    <w:lsdException w:qFormat="1" w:uiPriority="99" w:semiHidden="0" w:name="Body Text 2"/>
+    <w:lsdException w:qFormat="1" w:uiPriority="99" w:semiHidden="0" w:name="Body Text 3"/>
     <w:lsdException w:uiPriority="99" w:name="Body Text Indent 2"/>
     <w:lsdException w:uiPriority="99" w:name="Body Text Indent 3"/>
     <w:lsdException w:uiPriority="99" w:name="Block Text"/>
-    <w:lsdException w:uiPriority="99" w:name="Hyperlink"/>
+    <w:lsdException w:qFormat="1" w:uiPriority="99" w:name="Hyperlink"/>
     <w:lsdException w:uiPriority="99" w:name="FollowedHyperlink"/>
     <w:lsdException w:qFormat="1" w:unhideWhenUsed="0" w:uiPriority="22" w:semiHidden="0" w:name="Strong"/>
     <w:lsdException w:qFormat="1" w:unhideWhenUsed="0" w:uiPriority="20" w:semiHidden="0" w:name="Emphasis"/>
@@ -3021,31 +3510,31 @@
     <w:lsdException w:unhideWhenUsed="0" w:uiPriority="59" w:semiHidden="0" w:name="Table Grid"/>
     <w:lsdException w:uiPriority="99" w:name="Table Theme"/>
     <w:lsdException w:qFormat="1" w:unhideWhenUsed="0" w:uiPriority="1" w:semiHidden="0" w:name="No Spacing"/>
-    <w:lsdException w:unhideWhenUsed="0" w:uiPriority="60" w:semiHidden="0" w:name="Light Shading"/>
+    <w:lsdException w:qFormat="1" w:unhideWhenUsed="0" w:uiPriority="60" w:semiHidden="0" w:name="Light Shading"/>
     <w:lsdException w:unhideWhenUsed="0" w:uiPriority="61" w:semiHidden="0" w:name="Light List"/>
     <w:lsdException w:unhideWhenUsed="0" w:uiPriority="62" w:semiHidden="0" w:name="Light Grid"/>
-    <w:lsdException w:unhideWhenUsed="0" w:uiPriority="63" w:semiHidden="0" w:name="Medium Shading 1"/>
+    <w:lsdException w:qFormat="1" w:unhideWhenUsed="0" w:uiPriority="63" w:semiHidden="0" w:name="Medium Shading 1"/>
     <w:lsdException w:unhideWhenUsed="0" w:uiPriority="64" w:semiHidden="0" w:name="Medium Shading 2"/>
-    <w:lsdException w:unhideWhenUsed="0" w:uiPriority="65" w:semiHidden="0" w:name="Medium List 1"/>
-    <w:lsdException w:unhideWhenUsed="0" w:uiPriority="66" w:semiHidden="0" w:name="Medium List 2"/>
-    <w:lsdException w:unhideWhenUsed="0" w:uiPriority="67" w:semiHidden="0" w:name="Medium Grid 1"/>
+    <w:lsdException w:qFormat="1" w:unhideWhenUsed="0" w:uiPriority="65" w:semiHidden="0" w:name="Medium List 1"/>
+    <w:lsdException w:qFormat="1" w:unhideWhenUsed="0" w:uiPriority="66" w:semiHidden="0" w:name="Medium List 2"/>
+    <w:lsdException w:qFormat="1" w:unhideWhenUsed="0" w:uiPriority="67" w:semiHidden="0" w:name="Medium Grid 1"/>
     <w:lsdException w:unhideWhenUsed="0" w:uiPriority="68" w:semiHidden="0" w:name="Medium Grid 2"/>
     <w:lsdException w:unhideWhenUsed="0" w:uiPriority="69" w:semiHidden="0" w:name="Medium Grid 3"/>
     <w:lsdException w:unhideWhenUsed="0" w:uiPriority="70" w:semiHidden="0" w:name="Dark List"/>
     <w:lsdException w:unhideWhenUsed="0" w:uiPriority="71" w:semiHidden="0" w:name="Colorful Shading"/>
     <w:lsdException w:unhideWhenUsed="0" w:uiPriority="72" w:semiHidden="0" w:name="Colorful List"/>
     <w:lsdException w:unhideWhenUsed="0" w:uiPriority="73" w:semiHidden="0" w:name="Colorful Grid"/>
-    <w:lsdException w:unhideWhenUsed="0" w:uiPriority="60" w:semiHidden="0" w:name="Light Shading Accent 1"/>
-    <w:lsdException w:unhideWhenUsed="0" w:uiPriority="61" w:semiHidden="0" w:name="Light List Accent 1"/>
-    <w:lsdException w:unhideWhenUsed="0" w:uiPriority="62" w:semiHidden="0" w:name="Light Grid Accent 1"/>
-    <w:lsdException w:unhideWhenUsed="0" w:uiPriority="63" w:semiHidden="0" w:name="Medium Shading 1 Accent 1"/>
+    <w:lsdException w:qFormat="1" w:unhideWhenUsed="0" w:uiPriority="60" w:semiHidden="0" w:name="Light Shading Accent 1"/>
+    <w:lsdException w:qFormat="1" w:unhideWhenUsed="0" w:uiPriority="61" w:semiHidden="0" w:name="Light List Accent 1"/>
+    <w:lsdException w:qFormat="1" w:unhideWhenUsed="0" w:uiPriority="62" w:semiHidden="0" w:name="Light Grid Accent 1"/>
+    <w:lsdException w:qFormat="1" w:unhideWhenUsed="0" w:uiPriority="63" w:semiHidden="0" w:name="Medium Shading 1 Accent 1"/>
     <w:lsdException w:unhideWhenUsed="0" w:uiPriority="64" w:semiHidden="0" w:name="Medium Shading 2 Accent 1"/>
-    <w:lsdException w:unhideWhenUsed="0" w:uiPriority="65" w:semiHidden="0" w:name="Medium List 1 Accent 1"/>
+    <w:lsdException w:qFormat="1" w:unhideWhenUsed="0" w:uiPriority="65" w:semiHidden="0" w:name="Medium List 1 Accent 1"/>
     <w:lsdException w:qFormat="1" w:unhideWhenUsed="0" w:uiPriority="34" w:semiHidden="0" w:name="List Paragraph"/>
     <w:lsdException w:qFormat="1" w:unhideWhenUsed="0" w:uiPriority="29" w:semiHidden="0" w:name="Quote"/>
     <w:lsdException w:qFormat="1" w:unhideWhenUsed="0" w:uiPriority="30" w:semiHidden="0" w:name="Intense Quote"/>
     <w:lsdException w:unhideWhenUsed="0" w:uiPriority="66" w:semiHidden="0" w:name="Medium List 2 Accent 1"/>
-    <w:lsdException w:unhideWhenUsed="0" w:uiPriority="67" w:semiHidden="0" w:name="Medium Grid 1 Accent 1"/>
+    <w:lsdException w:qFormat="1" w:unhideWhenUsed="0" w:uiPriority="67" w:semiHidden="0" w:name="Medium Grid 1 Accent 1"/>
     <w:lsdException w:unhideWhenUsed="0" w:uiPriority="68" w:semiHidden="0" w:name="Medium Grid 2 Accent 1"/>
     <w:lsdException w:unhideWhenUsed="0" w:uiPriority="69" w:semiHidden="0" w:name="Medium Grid 3 Accent 1"/>
     <w:lsdException w:unhideWhenUsed="0" w:uiPriority="70" w:semiHidden="0" w:name="Dark List Accent 1"/>
@@ -3054,10 +3543,10 @@
     <w:lsdException w:unhideWhenUsed="0" w:uiPriority="73" w:semiHidden="0" w:name="Colorful Grid Accent 1"/>
     <w:lsdException w:unhideWhenUsed="0" w:uiPriority="60" w:semiHidden="0" w:name="Light Shading Accent 2"/>
     <w:lsdException w:unhideWhenUsed="0" w:uiPriority="61" w:semiHidden="0" w:name="Light List Accent 2"/>
-    <w:lsdException w:unhideWhenUsed="0" w:uiPriority="62" w:semiHidden="0" w:name="Light Grid Accent 2"/>
-    <w:lsdException w:unhideWhenUsed="0" w:uiPriority="63" w:semiHidden="0" w:name="Medium Shading 1 Accent 2"/>
+    <w:lsdException w:qFormat="1" w:unhideWhenUsed="0" w:uiPriority="62" w:semiHidden="0" w:name="Light Grid Accent 2"/>
+    <w:lsdException w:qFormat="1" w:unhideWhenUsed="0" w:uiPriority="63" w:semiHidden="0" w:name="Medium Shading 1 Accent 2"/>
     <w:lsdException w:unhideWhenUsed="0" w:uiPriority="64" w:semiHidden="0" w:name="Medium Shading 2 Accent 2"/>
-    <w:lsdException w:unhideWhenUsed="0" w:uiPriority="65" w:semiHidden="0" w:name="Medium List 1 Accent 2"/>
+    <w:lsdException w:qFormat="1" w:unhideWhenUsed="0" w:uiPriority="65" w:semiHidden="0" w:name="Medium List 1 Accent 2"/>
     <w:lsdException w:unhideWhenUsed="0" w:uiPriority="66" w:semiHidden="0" w:name="Medium List 2 Accent 2"/>
     <w:lsdException w:unhideWhenUsed="0" w:uiPriority="67" w:semiHidden="0" w:name="Medium Grid 1 Accent 2"/>
     <w:lsdException w:unhideWhenUsed="0" w:uiPriority="68" w:semiHidden="0" w:name="Medium Grid 2 Accent 2"/>
@@ -3066,11 +3555,11 @@
     <w:lsdException w:unhideWhenUsed="0" w:uiPriority="71" w:semiHidden="0" w:name="Colorful Shading Accent 2"/>
     <w:lsdException w:unhideWhenUsed="0" w:uiPriority="72" w:semiHidden="0" w:name="Colorful List Accent 2"/>
     <w:lsdException w:unhideWhenUsed="0" w:uiPriority="73" w:semiHidden="0" w:name="Colorful Grid Accent 2"/>
-    <w:lsdException w:unhideWhenUsed="0" w:uiPriority="60" w:semiHidden="0" w:name="Light Shading Accent 3"/>
-    <w:lsdException w:unhideWhenUsed="0" w:uiPriority="61" w:semiHidden="0" w:name="Light List Accent 3"/>
-    <w:lsdException w:unhideWhenUsed="0" w:uiPriority="62" w:semiHidden="0" w:name="Light Grid Accent 3"/>
-    <w:lsdException w:unhideWhenUsed="0" w:uiPriority="63" w:semiHidden="0" w:name="Medium Shading 1 Accent 3"/>
-    <w:lsdException w:unhideWhenUsed="0" w:uiPriority="64" w:semiHidden="0" w:name="Medium Shading 2 Accent 3"/>
+    <w:lsdException w:qFormat="1" w:unhideWhenUsed="0" w:uiPriority="60" w:semiHidden="0" w:name="Light Shading Accent 3"/>
+    <w:lsdException w:qFormat="1" w:unhideWhenUsed="0" w:uiPriority="61" w:semiHidden="0" w:name="Light List Accent 3"/>
+    <w:lsdException w:qFormat="1" w:unhideWhenUsed="0" w:uiPriority="62" w:semiHidden="0" w:name="Light Grid Accent 3"/>
+    <w:lsdException w:qFormat="1" w:unhideWhenUsed="0" w:uiPriority="63" w:semiHidden="0" w:name="Medium Shading 1 Accent 3"/>
+    <w:lsdException w:qFormat="1" w:unhideWhenUsed="0" w:uiPriority="64" w:semiHidden="0" w:name="Medium Shading 2 Accent 3"/>
     <w:lsdException w:unhideWhenUsed="0" w:uiPriority="65" w:semiHidden="0" w:name="Medium List 1 Accent 3"/>
     <w:lsdException w:unhideWhenUsed="0" w:uiPriority="66" w:semiHidden="0" w:name="Medium List 2 Accent 3"/>
     <w:lsdException w:unhideWhenUsed="0" w:uiPriority="67" w:semiHidden="0" w:name="Medium Grid 1 Accent 3"/>
@@ -3080,10 +3569,10 @@
     <w:lsdException w:unhideWhenUsed="0" w:uiPriority="71" w:semiHidden="0" w:name="Colorful Shading Accent 3"/>
     <w:lsdException w:unhideWhenUsed="0" w:uiPriority="72" w:semiHidden="0" w:name="Colorful List Accent 3"/>
     <w:lsdException w:unhideWhenUsed="0" w:uiPriority="73" w:semiHidden="0" w:name="Colorful Grid Accent 3"/>
-    <w:lsdException w:unhideWhenUsed="0" w:uiPriority="60" w:semiHidden="0" w:name="Light Shading Accent 4"/>
-    <w:lsdException w:unhideWhenUsed="0" w:uiPriority="61" w:semiHidden="0" w:name="Light List Accent 4"/>
+    <w:lsdException w:qFormat="1" w:unhideWhenUsed="0" w:uiPriority="60" w:semiHidden="0" w:name="Light Shading Accent 4"/>
+    <w:lsdException w:qFormat="1" w:unhideWhenUsed="0" w:uiPriority="61" w:semiHidden="0" w:name="Light List Accent 4"/>
     <w:lsdException w:unhideWhenUsed="0" w:uiPriority="62" w:semiHidden="0" w:name="Light Grid Accent 4"/>
-    <w:lsdException w:unhideWhenUsed="0" w:uiPriority="63" w:semiHidden="0" w:name="Medium Shading 1 Accent 4"/>
+    <w:lsdException w:qFormat="1" w:unhideWhenUsed="0" w:uiPriority="63" w:semiHidden="0" w:name="Medium Shading 1 Accent 4"/>
     <w:lsdException w:unhideWhenUsed="0" w:uiPriority="64" w:semiHidden="0" w:name="Medium Shading 2 Accent 4"/>
     <w:lsdException w:unhideWhenUsed="0" w:uiPriority="65" w:semiHidden="0" w:name="Medium List 1 Accent 4"/>
     <w:lsdException w:unhideWhenUsed="0" w:uiPriority="66" w:semiHidden="0" w:name="Medium List 2 Accent 4"/>
@@ -3095,12 +3584,12 @@
     <w:lsdException w:unhideWhenUsed="0" w:uiPriority="72" w:semiHidden="0" w:name="Colorful List Accent 4"/>
     <w:lsdException w:unhideWhenUsed="0" w:uiPriority="73" w:semiHidden="0" w:name="Colorful Grid Accent 4"/>
     <w:lsdException w:unhideWhenUsed="0" w:uiPriority="60" w:semiHidden="0" w:name="Light Shading Accent 5"/>
-    <w:lsdException w:unhideWhenUsed="0" w:uiPriority="61" w:semiHidden="0" w:name="Light List Accent 5"/>
-    <w:lsdException w:unhideWhenUsed="0" w:uiPriority="62" w:semiHidden="0" w:name="Light Grid Accent 5"/>
-    <w:lsdException w:unhideWhenUsed="0" w:uiPriority="63" w:semiHidden="0" w:name="Medium Shading 1 Accent 5"/>
-    <w:lsdException w:unhideWhenUsed="0" w:uiPriority="64" w:semiHidden="0" w:name="Medium Shading 2 Accent 5"/>
-    <w:lsdException w:unhideWhenUsed="0" w:uiPriority="65" w:semiHidden="0" w:name="Medium List 1 Accent 5"/>
-    <w:lsdException w:unhideWhenUsed="0" w:uiPriority="66" w:semiHidden="0" w:name="Medium List 2 Accent 5"/>
+    <w:lsdException w:qFormat="1" w:unhideWhenUsed="0" w:uiPriority="61" w:semiHidden="0" w:name="Light List Accent 5"/>
+    <w:lsdException w:qFormat="1" w:unhideWhenUsed="0" w:uiPriority="62" w:semiHidden="0" w:name="Light Grid Accent 5"/>
+    <w:lsdException w:qFormat="1" w:unhideWhenUsed="0" w:uiPriority="63" w:semiHidden="0" w:name="Medium Shading 1 Accent 5"/>
+    <w:lsdException w:qFormat="1" w:unhideWhenUsed="0" w:uiPriority="64" w:semiHidden="0" w:name="Medium Shading 2 Accent 5"/>
+    <w:lsdException w:qFormat="1" w:unhideWhenUsed="0" w:uiPriority="65" w:semiHidden="0" w:name="Medium List 1 Accent 5"/>
+    <w:lsdException w:qFormat="1" w:unhideWhenUsed="0" w:uiPriority="66" w:semiHidden="0" w:name="Medium List 2 Accent 5"/>
     <w:lsdException w:unhideWhenUsed="0" w:uiPriority="67" w:semiHidden="0" w:name="Medium Grid 1 Accent 5"/>
     <w:lsdException w:unhideWhenUsed="0" w:uiPriority="68" w:semiHidden="0" w:name="Medium Grid 2 Accent 5"/>
     <w:lsdException w:unhideWhenUsed="0" w:uiPriority="69" w:semiHidden="0" w:name="Medium Grid 3 Accent 5"/>
@@ -3110,8 +3599,8 @@
     <w:lsdException w:unhideWhenUsed="0" w:uiPriority="73" w:semiHidden="0" w:name="Colorful Grid Accent 5"/>
     <w:lsdException w:unhideWhenUsed="0" w:uiPriority="60" w:semiHidden="0" w:name="Light Shading Accent 6"/>
     <w:lsdException w:unhideWhenUsed="0" w:uiPriority="61" w:semiHidden="0" w:name="Light List Accent 6"/>
-    <w:lsdException w:unhideWhenUsed="0" w:uiPriority="62" w:semiHidden="0" w:name="Light Grid Accent 6"/>
-    <w:lsdException w:unhideWhenUsed="0" w:uiPriority="63" w:semiHidden="0" w:name="Medium Shading 1 Accent 6"/>
+    <w:lsdException w:qFormat="1" w:unhideWhenUsed="0" w:uiPriority="62" w:semiHidden="0" w:name="Light Grid Accent 6"/>
+    <w:lsdException w:qFormat="1" w:unhideWhenUsed="0" w:uiPriority="63" w:semiHidden="0" w:name="Medium Shading 1 Accent 6"/>
     <w:lsdException w:unhideWhenUsed="0" w:uiPriority="64" w:semiHidden="0" w:name="Medium Shading 2 Accent 6"/>
     <w:lsdException w:unhideWhenUsed="0" w:uiPriority="65" w:semiHidden="0" w:name="Medium List 1 Accent 6"/>
     <w:lsdException w:unhideWhenUsed="0" w:uiPriority="66" w:semiHidden="0" w:name="Medium List 2 Accent 6"/>
@@ -3377,6 +3866,7 @@
     <w:name w:val="Default Paragraph Font"/>
     <w:semiHidden/>
     <w:unhideWhenUsed/>
+    <w:qFormat/>
     <w:uiPriority w:val="1"/>
   </w:style>
   <w:style w:type="table" w:default="1" w:styleId="12">
@@ -3399,6 +3889,7 @@
     <w:basedOn w:val="1"/>
     <w:link w:val="145"/>
     <w:unhideWhenUsed/>
+    <w:qFormat/>
     <w:uiPriority w:val="99"/>
     <w:pPr>
       <w:spacing w:after="120"/>
@@ -3409,6 +3900,7 @@
     <w:basedOn w:val="1"/>
     <w:link w:val="146"/>
     <w:unhideWhenUsed/>
+    <w:qFormat/>
     <w:uiPriority w:val="99"/>
     <w:pPr>
       <w:spacing w:after="120" w:line="480" w:lineRule="auto"/>
@@ -3419,6 +3911,7 @@
     <w:basedOn w:val="1"/>
     <w:link w:val="147"/>
     <w:unhideWhenUsed/>
+    <w:qFormat/>
     <w:uiPriority w:val="99"/>
     <w:pPr>
       <w:spacing w:after="120"/>
@@ -3497,6 +3990,7 @@
     <w:basedOn w:val="11"/>
     <w:semiHidden/>
     <w:unhideWhenUsed/>
+    <w:qFormat/>
     <w:uiPriority w:val="99"/>
     <w:rPr>
       <w:color w:val="0000FF"/>
@@ -3507,6 +4001,7 @@
     <w:name w:val="List"/>
     <w:basedOn w:val="1"/>
     <w:unhideWhenUsed/>
+    <w:qFormat/>
     <w:uiPriority w:val="99"/>
     <w:pPr>
       <w:ind w:left="360" w:hanging="360"/>
@@ -3517,6 +4012,7 @@
     <w:name w:val="List 2"/>
     <w:basedOn w:val="1"/>
     <w:unhideWhenUsed/>
+    <w:qFormat/>
     <w:uiPriority w:val="99"/>
     <w:pPr>
       <w:ind w:left="720" w:hanging="360"/>
@@ -3527,6 +4023,7 @@
     <w:name w:val="List 3"/>
     <w:basedOn w:val="1"/>
     <w:unhideWhenUsed/>
+    <w:qFormat/>
     <w:uiPriority w:val="99"/>
     <w:pPr>
       <w:ind w:left="1080" w:hanging="360"/>
@@ -3537,6 +4034,7 @@
     <w:name w:val="List Bullet"/>
     <w:basedOn w:val="1"/>
     <w:unhideWhenUsed/>
+    <w:qFormat/>
     <w:uiPriority w:val="99"/>
     <w:pPr>
       <w:numPr>
@@ -3576,6 +4074,7 @@
     <w:name w:val="List Continue"/>
     <w:basedOn w:val="1"/>
     <w:unhideWhenUsed/>
+    <w:qFormat/>
     <w:uiPriority w:val="99"/>
     <w:pPr>
       <w:spacing w:after="120"/>
@@ -3622,6 +4121,7 @@
     <w:name w:val="List Number 2"/>
     <w:basedOn w:val="1"/>
     <w:unhideWhenUsed/>
+    <w:qFormat/>
     <w:uiPriority w:val="99"/>
     <w:pPr>
       <w:numPr>
@@ -3750,6 +4250,7 @@
   <w:style w:type="table" w:styleId="38">
     <w:name w:val="Light Shading"/>
     <w:basedOn w:val="12"/>
+    <w:qFormat/>
     <w:uiPriority w:val="60"/>
     <w:pPr>
       <w:spacing w:after="0" w:line="240" w:lineRule="auto"/>
@@ -3849,6 +4350,7 @@
   <w:style w:type="table" w:styleId="39">
     <w:name w:val="Light Shading Accent 1"/>
     <w:basedOn w:val="12"/>
+    <w:qFormat/>
     <w:uiPriority w:val="60"/>
     <w:pPr>
       <w:spacing w:after="0" w:line="240" w:lineRule="auto"/>
@@ -4047,6 +4549,7 @@
   <w:style w:type="table" w:styleId="41">
     <w:name w:val="Light Shading Accent 3"/>
     <w:basedOn w:val="12"/>
+    <w:qFormat/>
     <w:uiPriority w:val="60"/>
     <w:pPr>
       <w:spacing w:after="0" w:line="240" w:lineRule="auto"/>
@@ -4146,6 +4649,7 @@
   <w:style w:type="table" w:styleId="42">
     <w:name w:val="Light Shading Accent 4"/>
     <w:basedOn w:val="12"/>
+    <w:qFormat/>
     <w:uiPriority w:val="60"/>
     <w:pPr>
       <w:spacing w:after="0" w:line="240" w:lineRule="auto"/>
@@ -4536,6 +5040,7 @@
   <w:style w:type="table" w:styleId="46">
     <w:name w:val="Light List Accent 1"/>
     <w:basedOn w:val="12"/>
+    <w:qFormat/>
     <w:uiPriority w:val="61"/>
     <w:pPr>
       <w:spacing w:after="0" w:line="240" w:lineRule="auto"/>
@@ -4722,6 +5227,7 @@
   <w:style w:type="table" w:styleId="48">
     <w:name w:val="Light List Accent 3"/>
     <w:basedOn w:val="12"/>
+    <w:qFormat/>
     <w:uiPriority w:val="61"/>
     <w:pPr>
       <w:spacing w:after="0" w:line="240" w:lineRule="auto"/>
@@ -4815,6 +5321,7 @@
   <w:style w:type="table" w:styleId="49">
     <w:name w:val="Light List Accent 4"/>
     <w:basedOn w:val="12"/>
+    <w:qFormat/>
     <w:uiPriority w:val="61"/>
     <w:pPr>
       <w:spacing w:after="0" w:line="240" w:lineRule="auto"/>
@@ -4908,6 +5415,7 @@
   <w:style w:type="table" w:styleId="50">
     <w:name w:val="Light List Accent 5"/>
     <w:basedOn w:val="12"/>
+    <w:qFormat/>
     <w:uiPriority w:val="61"/>
     <w:pPr>
       <w:spacing w:after="0" w:line="240" w:lineRule="auto"/>
@@ -5220,6 +5728,7 @@
   <w:style w:type="table" w:styleId="53">
     <w:name w:val="Light Grid Accent 1"/>
     <w:basedOn w:val="12"/>
+    <w:qFormat/>
     <w:uiPriority w:val="62"/>
     <w:pPr>
       <w:spacing w:after="0" w:line="240" w:lineRule="auto"/>
@@ -5346,6 +5855,7 @@
   <w:style w:type="table" w:styleId="54">
     <w:name w:val="Light Grid Accent 2"/>
     <w:basedOn w:val="12"/>
+    <w:qFormat/>
     <w:uiPriority w:val="62"/>
     <w:pPr>
       <w:spacing w:after="0" w:line="240" w:lineRule="auto"/>
@@ -5472,6 +5982,7 @@
   <w:style w:type="table" w:styleId="55">
     <w:name w:val="Light Grid Accent 3"/>
     <w:basedOn w:val="12"/>
+    <w:qFormat/>
     <w:uiPriority w:val="62"/>
     <w:pPr>
       <w:spacing w:after="0" w:line="240" w:lineRule="auto"/>
@@ -5724,6 +6235,7 @@
   <w:style w:type="table" w:styleId="57">
     <w:name w:val="Light Grid Accent 5"/>
     <w:basedOn w:val="12"/>
+    <w:qFormat/>
     <w:uiPriority w:val="62"/>
     <w:pPr>
       <w:spacing w:after="0" w:line="240" w:lineRule="auto"/>
@@ -5850,6 +6362,7 @@
   <w:style w:type="table" w:styleId="58">
     <w:name w:val="Light Grid Accent 6"/>
     <w:basedOn w:val="12"/>
+    <w:qFormat/>
     <w:uiPriority w:val="62"/>
     <w:pPr>
       <w:spacing w:after="0" w:line="240" w:lineRule="auto"/>
@@ -5976,6 +6489,7 @@
   <w:style w:type="table" w:styleId="59">
     <w:name w:val="Medium Shading 1"/>
     <w:basedOn w:val="12"/>
+    <w:qFormat/>
     <w:uiPriority w:val="63"/>
     <w:pPr>
       <w:spacing w:after="0" w:line="240" w:lineRule="auto"/>
@@ -6083,6 +6597,7 @@
   <w:style w:type="table" w:styleId="60">
     <w:name w:val="Medium Shading 1 Accent 1"/>
     <w:basedOn w:val="12"/>
+    <w:qFormat/>
     <w:uiPriority w:val="63"/>
     <w:pPr>
       <w:spacing w:after="0" w:line="240" w:lineRule="auto"/>
@@ -6190,6 +6705,7 @@
   <w:style w:type="table" w:styleId="61">
     <w:name w:val="Medium Shading 1 Accent 2"/>
     <w:basedOn w:val="12"/>
+    <w:qFormat/>
     <w:uiPriority w:val="63"/>
     <w:pPr>
       <w:spacing w:after="0" w:line="240" w:lineRule="auto"/>
@@ -6297,6 +6813,7 @@
   <w:style w:type="table" w:styleId="62">
     <w:name w:val="Medium Shading 1 Accent 3"/>
     <w:basedOn w:val="12"/>
+    <w:qFormat/>
     <w:uiPriority w:val="63"/>
     <w:pPr>
       <w:spacing w:after="0" w:line="240" w:lineRule="auto"/>
@@ -6404,6 +6921,7 @@
   <w:style w:type="table" w:styleId="63">
     <w:name w:val="Medium Shading 1 Accent 4"/>
     <w:basedOn w:val="12"/>
+    <w:qFormat/>
     <w:uiPriority w:val="63"/>
     <w:pPr>
       <w:spacing w:after="0" w:line="240" w:lineRule="auto"/>
@@ -6511,6 +7029,7 @@
   <w:style w:type="table" w:styleId="64">
     <w:name w:val="Medium Shading 1 Accent 5"/>
     <w:basedOn w:val="12"/>
+    <w:qFormat/>
     <w:uiPriority w:val="63"/>
     <w:pPr>
       <w:spacing w:after="0" w:line="240" w:lineRule="auto"/>
@@ -6618,6 +7137,7 @@
   <w:style w:type="table" w:styleId="65">
     <w:name w:val="Medium Shading 1 Accent 6"/>
     <w:basedOn w:val="12"/>
+    <w:qFormat/>
     <w:uiPriority w:val="63"/>
     <w:pPr>
       <w:spacing w:after="0" w:line="240" w:lineRule="auto"/>
@@ -7220,6 +7740,7 @@
   <w:style w:type="table" w:styleId="69">
     <w:name w:val="Medium Shading 2 Accent 3"/>
     <w:basedOn w:val="12"/>
+    <w:qFormat/>
     <w:uiPriority w:val="64"/>
     <w:pPr>
       <w:spacing w:after="0" w:line="240" w:lineRule="auto"/>
@@ -7550,6 +8071,7 @@
   <w:style w:type="table" w:styleId="71">
     <w:name w:val="Medium Shading 2 Accent 5"/>
     <w:basedOn w:val="12"/>
+    <w:qFormat/>
     <w:uiPriority w:val="64"/>
     <w:pPr>
       <w:spacing w:after="0" w:line="240" w:lineRule="auto"/>
@@ -7880,6 +8402,7 @@
   <w:style w:type="table" w:styleId="73">
     <w:name w:val="Medium List 1"/>
     <w:basedOn w:val="12"/>
+    <w:qFormat/>
     <w:uiPriority w:val="65"/>
     <w:pPr>
       <w:spacing w:after="0" w:line="240" w:lineRule="auto"/>
@@ -7970,6 +8493,7 @@
   <w:style w:type="table" w:styleId="74">
     <w:name w:val="Medium List 1 Accent 1"/>
     <w:basedOn w:val="12"/>
+    <w:qFormat/>
     <w:uiPriority w:val="65"/>
     <w:pPr>
       <w:spacing w:after="0" w:line="240" w:lineRule="auto"/>
@@ -8060,6 +8584,7 @@
   <w:style w:type="table" w:styleId="75">
     <w:name w:val="Medium List 1 Accent 2"/>
     <w:basedOn w:val="12"/>
+    <w:qFormat/>
     <w:uiPriority w:val="65"/>
     <w:pPr>
       <w:spacing w:after="0" w:line="240" w:lineRule="auto"/>
@@ -8330,6 +8855,7 @@
   <w:style w:type="table" w:styleId="78">
     <w:name w:val="Medium List 1 Accent 5"/>
     <w:basedOn w:val="12"/>
+    <w:qFormat/>
     <w:uiPriority w:val="65"/>
     <w:pPr>
       <w:spacing w:after="0" w:line="240" w:lineRule="auto"/>
@@ -8510,6 +9036,7 @@
   <w:style w:type="table" w:styleId="80">
     <w:name w:val="Medium List 2"/>
     <w:basedOn w:val="12"/>
+    <w:qFormat/>
     <w:uiPriority w:val="66"/>
     <w:pPr>
       <w:spacing w:after="0" w:line="240" w:lineRule="auto"/>
@@ -9155,6 +9682,7 @@
   <w:style w:type="table" w:styleId="85">
     <w:name w:val="Medium List 2 Accent 5"/>
     <w:basedOn w:val="12"/>
+    <w:qFormat/>
     <w:uiPriority w:val="66"/>
     <w:pPr>
       <w:spacing w:after="0" w:line="240" w:lineRule="auto"/>
@@ -9413,6 +9941,7 @@
   <w:style w:type="table" w:styleId="87">
     <w:name w:val="Medium Grid 1"/>
     <w:basedOn w:val="12"/>
+    <w:qFormat/>
     <w:uiPriority w:val="67"/>
     <w:pPr>
       <w:spacing w:after="0" w:line="240" w:lineRule="auto"/>
@@ -9482,6 +10011,7 @@
   <w:style w:type="table" w:styleId="88">
     <w:name w:val="Medium Grid 1 Accent 1"/>
     <w:basedOn w:val="12"/>
+    <w:qFormat/>
     <w:uiPriority w:val="67"/>
     <w:pPr>
       <w:spacing w:after="0" w:line="240" w:lineRule="auto"/>

</xml_diff>